<commit_message>
Redesign Tablet POS UI: 1280x800 Landscape, Premium Minimalist
</commit_message>
<xml_diff>
--- a/spec_commission_vi.docx
+++ b/spec_commission_vi.docx
@@ -2489,7 +2489,7 @@
                 <w:sz w:val="18"/>
                 <w:szCs w:val="18"/>
               </w:rPr>
-              <w:t xml:space="preserve">Số tiền hoa hồng. Âm (trả hàng) hiển thị màu đỏ (−¥X). Dương hiển thị màu xanh (primary).</w:t>
+              <w:t xml:space="preserve">Số tiền hoa hồng. Âm (trả hàng) hiển thị màu đỏ (−¥X). Dương hiển thị màu tím (#6A1B9A).</w:t>
             </w:r>
           </w:p>
         </w:tc>
@@ -4570,7 +4570,7 @@
                 <w:sz w:val="18"/>
                 <w:szCs w:val="18"/>
               </w:rPr>
-              <w:t xml:space="preserve">Số tiền hoa hồng lớn, in đậm, màu primary</w:t>
+              <w:t xml:space="preserve">Số tiền hoa hồng lớn, in đậm, màu tím (#6A1B9A)</w:t>
             </w:r>
           </w:p>
         </w:tc>
@@ -4757,6 +4757,25 @@
           <w:szCs w:val="26"/>
         </w:rPr>
         <w:t xml:space="preserve">5.3 Next Action Card – Điều kiện hiển thị</w:t>
+      </w:r>
+    </w:p>
+    <w:p>
+      <w:pPr>
+        <w:spacing w:after="80" w:before="80"/>
+      </w:pPr>
+    </w:p>
+    <w:p>
+      <w:pPr>
+        <w:spacing w:after="60" w:before="60"/>
+      </w:pPr>
+      <w:r>
+        <w:rPr>
+          <w:rFonts w:ascii="Arial" w:cs="Arial" w:eastAsia="Arial" w:hAnsi="Arial"/>
+          <w:color w:val="555555"/>
+          <w:sz w:val="22"/>
+          <w:szCs w:val="22"/>
+        </w:rPr>
+        <w:t xml:space="preserve">Next Action Card sử dụng CSS class thống nhất: accent-warning (cam), accent-success (xanh lá), accent-primary (xanh dương). Không dùng inline style cho border-left và background.</w:t>
       </w:r>
     </w:p>
     <w:p>
@@ -4839,7 +4858,7 @@
                 <w:sz w:val="20"/>
                 <w:szCs w:val="20"/>
               </w:rPr>
-              <w:t xml:space="preserve">Trạng thái: 一時計上 | Hiển thị: Button 「確定する」(màu cam #E67E22) + Button 「却下する」(viền đỏ)</w:t>
+              <w:t xml:space="preserve">Trạng thái: 一時計上 | Class: accent-warning | Button 「確定する」(màu cam #E67E22) + Button 「却下する」(viền đỏ)</w:t>
             </w:r>
           </w:p>
         </w:tc>
@@ -4943,7 +4962,7 @@
                 <w:sz w:val="20"/>
                 <w:szCs w:val="20"/>
               </w:rPr>
-              <w:t xml:space="preserve">Trạng thái: 確定済み | Hiển thị: Button 「支払依頼を登録する」(màu xanh lá #2ECC71)</w:t>
+              <w:t xml:space="preserve">Trạng thái: 確定済み | Class: accent-success | Button 「支払依頼を登録する」(màu xanh lá #2ECC71)</w:t>
             </w:r>
           </w:p>
         </w:tc>
@@ -5047,7 +5066,7 @@
                 <w:sz w:val="20"/>
                 <w:szCs w:val="20"/>
               </w:rPr>
-              <w:t xml:space="preserve">Trạng thái: 支払申請済み | Hiển thị: Button 「支払確認へ進む」(màu xanh lá) → link đến payment_request_detail.html</w:t>
+              <w:t xml:space="preserve">Trạng thái: 支払申請済み | Class: accent-success | Button 「支払確認へ進む」(màu xanh lá) → link đến payment_request_detail.html</w:t>
             </w:r>
           </w:p>
         </w:tc>
@@ -5385,7 +5404,7 @@
                 <w:sz w:val="20"/>
                 <w:szCs w:val="20"/>
               </w:rPr>
-              <w:t xml:space="preserve">Tổng hoa hồng – font lớn, màu primary, in đậm</w:t>
+              <w:t xml:space="preserve">Tổng hoa hồng – font lớn, màu tím (#6A1B9A), in đậm</w:t>
             </w:r>
           </w:p>
         </w:tc>
@@ -6290,7 +6309,7 @@
                 <w:sz w:val="18"/>
                 <w:szCs w:val="18"/>
               </w:rPr>
-              <w:t xml:space="preserve">Tiền hoa hồng của dòng này. Âm (trả hàng) màu đỏ, dương màu primary xanh.</w:t>
+              <w:t xml:space="preserve">Tiền hoa hồng của dòng này. Âm (trả hàng) màu đỏ, dương màu tím (#6A1B9A).</w:t>
             </w:r>
           </w:p>
         </w:tc>
@@ -6351,7 +6370,7 @@
           <w:sz w:val="22"/>
           <w:szCs w:val="22"/>
         </w:rPr>
-        <w:t xml:space="preserve">Tổng hoa hồng: font lớn, màu primary, gạch kép (border-bottom: double).</w:t>
+        <w:t xml:space="preserve">Tổng hoa hồng: font lớn, màu tím (#6A1B9A), gạch kép (border-bottom: double).</w:t>
       </w:r>
     </w:p>
     <w:p>

</xml_diff>